<commit_message>
upload lab6 and update root/lab5 readmes
</commit_message>
<xml_diff>
--- a/Lab-05-Custom-Log-Based-IDS-Script/Lab5-Investigation-Writeup-Template.docx
+++ b/Lab-05-Custom-Log-Based-IDS-Script/Lab5-Investigation-Writeup-Template.docx
@@ -250,7 +250,7 @@
                 <w:iCs/>
                 <w:color w:val="888888"/>
               </w:rPr>
-              <w:t xml:space="preserve">Custom Python script polling Elasticsearch, sliding 60s window, threshold &gt;5, 180s cooldown</w:t>
+              <w:t xml:space="preserve">Custom Python script polling Elasticsearch, sliding 60s window, threshold &gt;3, 180s cooldown</w:t>
             </w:r>
           </w:p>
         </w:tc>
@@ -446,7 +446,7 @@
         <w:spacing w:after="160"/>
       </w:pPr>
       <w:r>
-        <w:t xml:space="preserve">A custom Python script polls Elasticsearch's ssh-auth-logs-* index every 10 seconds for new failed-login events, extracts the source IP via regex from the raw message field, and maintains an in-memory sliding 60-second window of failure timestamps per source IP. When any source IP exceeds 5 failures within that live window, a structured alert document is posted to a dedicated custom-ids-alerts-* index, subject to a 180-second cooldown per source IP to prevent alert flooding.</w:t>
+        <w:t xml:space="preserve">A custom Python script polls Elasticsearch's ssh-auth-logs-* index every 10 seconds for new failed-login events, extracts the source IP via regex from the raw message field, and maintains an in-memory sliding 60-second window of failure timestamps per source IP. When any source IP exceeds 3 failures within that live window, a structured alert document is posted to a dedicated custom-ids-alerts-* index, subject to a 180-second cooldown per source IP to prevent alert flooding. The threshold was set below the wordlist's raw attempt count after confirming this legacy target's logging consolidates some repeated failures into summary lines rather than discrete, individually-matchable events.</w:t>
       </w:r>
     </w:p>
     <w:p>

</xml_diff>